<commit_message>
Expose horizon-dependent pressure release in common slow-chamber scenario
</commit_message>
<xml_diff>
--- a/homework7_2_rewrite/deliverables/第七章_习题7-2_重写版报告.docx
+++ b/homework7_2_rewrite/deliverables/第七章_习题7-2_重写版报告.docx
@@ -2,7 +2,7 @@
 <file path=word/document.xml><?xml version="1.0" encoding="utf-8"?>
 <w:document xmlns:w="http://schemas.openxmlformats.org/wordprocessingml/2006/main" xmlns:m="http://schemas.openxmlformats.org/officeDocument/2006/math" xmlns:r="http://schemas.openxmlformats.org/officeDocument/2006/relationships" xmlns:o="urn:schemas-microsoft-com:office:office" xmlns:v="urn:schemas-microsoft-com:vml" xmlns:w10="urn:schemas-microsoft-com:office:word" xmlns:a="http://schemas.openxmlformats.org/drawingml/2006/main" xmlns:pic="http://schemas.openxmlformats.org/drawingml/2006/picture" xmlns:wp="http://schemas.openxmlformats.org/drawingml/2006/wordprocessingDrawing">
   <w:body>
-    <w:bookmarkStart w:id="34" w:name="第七章习题-7-2预测时域对制动限压与计算开销的影响"/>
+    <w:bookmarkStart w:id="39" w:name="第七章习题-7-2预测时域对制动限压与计算开销的影响"/>
     <w:p>
       <w:pPr>
         <w:pStyle w:val="Heading1"/>
@@ -1034,7 +1034,7 @@
               <w:rPr>
                 <w:sz w:val="18"/>
               </w:rPr>
-              <w:t xml:space="preserve">71.4286 kg</w:t>
+              <w:t xml:space="preserve">50 kg</w:t>
             </w:r>
           </w:p>
         </w:tc>
@@ -1153,7 +1153,7 @@
               <w:rPr>
                 <w:sz w:val="18"/>
               </w:rPr>
-              <w:t xml:space="preserve">714.2857 N·s/m</w:t>
+              <w:t xml:space="preserve">2500 N·s/m</w:t>
             </w:r>
           </w:p>
         </w:tc>
@@ -1289,6 +1289,15 @@
               <w:jc w:val="right"/>
             </w:pPr>
             <m:oMath>
+              <m:r>
+                <m:t>8</m:t>
+              </m:r>
+              <m:r>
+                <m:rPr>
+                  <m:sty m:val="p"/>
+                </m:rPr>
+                <m:t>×</m:t>
+              </m:r>
               <m:sSup>
                 <m:e>
                   <m:r>
@@ -2646,7 +2655,7 @@
             <m:t>−</m:t>
           </m:r>
           <m:r>
-            <m:t>10</m:t>
+            <m:t>50</m:t>
           </m:r>
           <m:sSub>
             <m:e>
@@ -2667,7 +2676,7 @@
             <m:t>+</m:t>
           </m:r>
           <m:r>
-            <m:t>14</m:t>
+            <m:t>20</m:t>
           </m:r>
           <m:r>
             <m:t>Δ</m:t>
@@ -2691,7 +2700,7 @@
             <m:t>−</m:t>
           </m:r>
           <m:r>
-            <m:t>7</m:t>
+            <m:t>10</m:t>
           </m:r>
           <m:r>
             <m:t>Δ</m:t>
@@ -2755,7 +2764,7 @@
             <m:t>=</m:t>
           </m:r>
           <m:r>
-            <m:t>1500</m:t>
+            <m:t>187.5</m:t>
           </m:r>
           <m:r>
             <m:t>u</m:t>
@@ -2767,7 +2776,7 @@
             <m:t>−</m:t>
           </m:r>
           <m:r>
-            <m:t>10000</m:t>
+            <m:t>1250</m:t>
           </m:r>
           <m:sSub>
             <m:e>
@@ -2788,7 +2797,7 @@
             <m:t>−</m:t>
           </m:r>
           <m:r>
-            <m:t>1000</m:t>
+            <m:t>125</m:t>
           </m:r>
           <m:r>
             <m:t>Δ</m:t>
@@ -3249,14 +3258,22 @@
         <w:pStyle w:val="FirstParagraph"/>
       </w:pPr>
       <w:r>
-        <w:t xml:space="preserve">压力系数含</w:t>
+        <w:t xml:space="preserve">两腔压力方程的局部阻尼系数分别为</w:t>
       </w:r>
       <w:r>
         <w:t xml:space="preserve"> </w:t>
       </w:r>
       <m:oMath>
         <m:r>
-          <m:t>1000</m:t>
+          <m:t>125</m:t>
+        </m:r>
+      </m:oMath>
+      <w:r>
+        <w:t xml:space="preserve">、</w:t>
+      </w:r>
+      <m:oMath>
+        <m:r>
+          <m:t>500</m:t>
         </m:r>
         <m:r>
           <m:t> </m:t>
@@ -3284,10 +3301,7 @@
         </m:sSup>
       </m:oMath>
       <w:r>
-        <w:t xml:space="preserve"> </w:t>
-      </w:r>
-      <w:r>
-        <w:t xml:space="preserve">模态，1 ms Euler 步长会带来较大的压力动态误差；ZOH 保留恒定电压期间的精确响应。每步施加的电压确实保持 1 ms，因而预测与连续对象的采样节点一致。</w:t>
+        <w:t xml:space="preserve">，1 ms Euler 步长会带来压力动态误差；ZOH 保留恒定电压期间的精确响应。每步施加的电压确实保持 1 ms，因而预测与连续对象的采样节点一致。</w:t>
       </w:r>
     </w:p>
     <w:p>
@@ -4192,7 +4206,7 @@
                     <m:t>+</m:t>
                   </m:r>
                   <m:r>
-                    <m:t>2</m:t>
+                    <m:t>0.5</m:t>
                   </m:r>
                   <m:sSubSup>
                     <m:e>
@@ -4380,7 +4394,7 @@
           <m:t>=</m:t>
         </m:r>
         <m:r>
-          <m:t>2</m:t>
+          <m:t>0.5</m:t>
         </m:r>
         <m:r>
           <m:rPr>
@@ -4418,7 +4432,7 @@
           <m:t>,</m:t>
         </m:r>
         <m:r>
-          <m:t>200</m:t>
+          <m:t>50</m:t>
         </m:r>
         <m:r>
           <m:rPr>
@@ -5248,7 +5262,7 @@
       </w:r>
     </w:p>
     <w:bookmarkEnd w:id="25"/>
-    <w:bookmarkStart w:id="30" w:name="七组闭环结果"/>
+    <w:bookmarkStart w:id="35" w:name="七组闭环结果"/>
     <w:p>
       <w:pPr>
         <w:pStyle w:val="Heading2"/>
@@ -5404,7 +5418,7 @@
               <w:rPr>
                 <w:sz w:val="18"/>
               </w:rPr>
-              <w:t xml:space="preserve">最小两腔压力 (MPa)</w:t>
+              <w:t xml:space="preserve">≥20 MPa 持续 (ms)</w:t>
             </w:r>
           </w:p>
         </w:tc>
@@ -5481,67 +5495,67 @@
               <w:rPr>
                 <w:sz w:val="18"/>
               </w:rPr>
-              <w:t xml:space="preserve">0.866</w:t>
-            </w:r>
-          </w:p>
-        </w:tc>
-        <w:tc>
-          <w:tcPr/>
-          <w:p>
-            <w:pPr>
-              <w:pStyle w:val="Compact"/>
-              <w:jc w:val="right"/>
-            </w:pPr>
-            <w:r>
-              <w:rPr>
-                <w:sz w:val="18"/>
-              </w:rPr>
-              <w:t xml:space="preserve">20.8231</w:t>
-            </w:r>
-          </w:p>
-        </w:tc>
-        <w:tc>
-          <w:tcPr/>
-          <w:p>
-            <w:pPr>
-              <w:pStyle w:val="Compact"/>
-              <w:jc w:val="right"/>
-            </w:pPr>
-            <w:r>
-              <w:rPr>
-                <w:sz w:val="18"/>
-              </w:rPr>
-              <w:t xml:space="preserve">0.1122</w:t>
-            </w:r>
-          </w:p>
-        </w:tc>
-        <w:tc>
-          <w:tcPr/>
-          <w:p>
-            <w:pPr>
-              <w:pStyle w:val="Compact"/>
-              <w:jc w:val="right"/>
-            </w:pPr>
-            <w:r>
-              <w:rPr>
-                <w:sz w:val="18"/>
-              </w:rPr>
-              <w:t xml:space="preserve">0.105</w:t>
-            </w:r>
-          </w:p>
-        </w:tc>
-        <w:tc>
-          <w:tcPr/>
-          <w:p>
-            <w:pPr>
-              <w:pStyle w:val="Compact"/>
-              <w:jc w:val="right"/>
-            </w:pPr>
-            <w:r>
-              <w:rPr>
-                <w:sz w:val="18"/>
-              </w:rPr>
-              <w:t xml:space="preserve">0.401</w:t>
+              <w:t xml:space="preserve">1.391</w:t>
+            </w:r>
+          </w:p>
+        </w:tc>
+        <w:tc>
+          <w:tcPr/>
+          <w:p>
+            <w:pPr>
+              <w:pStyle w:val="Compact"/>
+              <w:jc w:val="right"/>
+            </w:pPr>
+            <w:r>
+              <w:rPr>
+                <w:sz w:val="18"/>
+              </w:rPr>
+              <w:t xml:space="preserve">20.8609</w:t>
+            </w:r>
+          </w:p>
+        </w:tc>
+        <w:tc>
+          <w:tcPr/>
+          <w:p>
+            <w:pPr>
+              <w:pStyle w:val="Compact"/>
+              <w:jc w:val="right"/>
+            </w:pPr>
+            <w:r>
+              <w:rPr>
+                <w:sz w:val="18"/>
+              </w:rPr>
+              <w:t xml:space="preserve">5.075</w:t>
+            </w:r>
+          </w:p>
+        </w:tc>
+        <w:tc>
+          <w:tcPr/>
+          <w:p>
+            <w:pPr>
+              <w:pStyle w:val="Compact"/>
+              <w:jc w:val="right"/>
+            </w:pPr>
+            <w:r>
+              <w:rPr>
+                <w:sz w:val="18"/>
+              </w:rPr>
+              <w:t xml:space="preserve">0.119</w:t>
+            </w:r>
+          </w:p>
+        </w:tc>
+        <w:tc>
+          <w:tcPr/>
+          <w:p>
+            <w:pPr>
+              <w:pStyle w:val="Compact"/>
+              <w:jc w:val="right"/>
+            </w:pPr>
+            <w:r>
+              <w:rPr>
+                <w:sz w:val="18"/>
+              </w:rPr>
+              <w:t xml:space="preserve">0.285</w:t>
             </w:r>
           </w:p>
         </w:tc>
@@ -5588,67 +5602,67 @@
               <w:rPr>
                 <w:sz w:val="18"/>
               </w:rPr>
-              <w:t xml:space="preserve">0.263</w:t>
-            </w:r>
-          </w:p>
-        </w:tc>
-        <w:tc>
-          <w:tcPr/>
-          <w:p>
-            <w:pPr>
-              <w:pStyle w:val="Compact"/>
-              <w:jc w:val="right"/>
-            </w:pPr>
-            <w:r>
-              <w:rPr>
-                <w:sz w:val="18"/>
-              </w:rPr>
-              <w:t xml:space="preserve">20.8290</w:t>
-            </w:r>
-          </w:p>
-        </w:tc>
-        <w:tc>
-          <w:tcPr/>
-          <w:p>
-            <w:pPr>
-              <w:pStyle w:val="Compact"/>
-              <w:jc w:val="right"/>
-            </w:pPr>
-            <w:r>
-              <w:rPr>
-                <w:sz w:val="18"/>
-              </w:rPr>
-              <w:t xml:space="preserve">0.1733</w:t>
-            </w:r>
-          </w:p>
-        </w:tc>
-        <w:tc>
-          <w:tcPr/>
-          <w:p>
-            <w:pPr>
-              <w:pStyle w:val="Compact"/>
-              <w:jc w:val="right"/>
-            </w:pPr>
-            <w:r>
-              <w:rPr>
-                <w:sz w:val="18"/>
-              </w:rPr>
-              <w:t xml:space="preserve">0.270</w:t>
-            </w:r>
-          </w:p>
-        </w:tc>
-        <w:tc>
-          <w:tcPr/>
-          <w:p>
-            <w:pPr>
-              <w:pStyle w:val="Compact"/>
-              <w:jc w:val="right"/>
-            </w:pPr>
-            <w:r>
-              <w:rPr>
-                <w:sz w:val="18"/>
-              </w:rPr>
-              <w:t xml:space="preserve">0.877</w:t>
+              <w:t xml:space="preserve">0.488</w:t>
+            </w:r>
+          </w:p>
+        </w:tc>
+        <w:tc>
+          <w:tcPr/>
+          <w:p>
+            <w:pPr>
+              <w:pStyle w:val="Compact"/>
+              <w:jc w:val="right"/>
+            </w:pPr>
+            <w:r>
+              <w:rPr>
+                <w:sz w:val="18"/>
+              </w:rPr>
+              <w:t xml:space="preserve">20.8426</w:t>
+            </w:r>
+          </w:p>
+        </w:tc>
+        <w:tc>
+          <w:tcPr/>
+          <w:p>
+            <w:pPr>
+              <w:pStyle w:val="Compact"/>
+              <w:jc w:val="right"/>
+            </w:pPr>
+            <w:r>
+              <w:rPr>
+                <w:sz w:val="18"/>
+              </w:rPr>
+              <w:t xml:space="preserve">3.925</w:t>
+            </w:r>
+          </w:p>
+        </w:tc>
+        <w:tc>
+          <w:tcPr/>
+          <w:p>
+            <w:pPr>
+              <w:pStyle w:val="Compact"/>
+              <w:jc w:val="right"/>
+            </w:pPr>
+            <w:r>
+              <w:rPr>
+                <w:sz w:val="18"/>
+              </w:rPr>
+              <w:t xml:space="preserve">0.275</w:t>
+            </w:r>
+          </w:p>
+        </w:tc>
+        <w:tc>
+          <w:tcPr/>
+          <w:p>
+            <w:pPr>
+              <w:pStyle w:val="Compact"/>
+              <w:jc w:val="right"/>
+            </w:pPr>
+            <w:r>
+              <w:rPr>
+                <w:sz w:val="18"/>
+              </w:rPr>
+              <w:t xml:space="preserve">0.712</w:t>
             </w:r>
           </w:p>
         </w:tc>
@@ -5695,67 +5709,67 @@
               <w:rPr>
                 <w:sz w:val="18"/>
               </w:rPr>
-              <w:t xml:space="preserve">0.265</w:t>
-            </w:r>
-          </w:p>
-        </w:tc>
-        <w:tc>
-          <w:tcPr/>
-          <w:p>
-            <w:pPr>
-              <w:pStyle w:val="Compact"/>
-              <w:jc w:val="right"/>
-            </w:pPr>
-            <w:r>
-              <w:rPr>
-                <w:sz w:val="18"/>
-              </w:rPr>
-              <w:t xml:space="preserve">20.8290</w:t>
-            </w:r>
-          </w:p>
-        </w:tc>
-        <w:tc>
-          <w:tcPr/>
-          <w:p>
-            <w:pPr>
-              <w:pStyle w:val="Compact"/>
-              <w:jc w:val="right"/>
-            </w:pPr>
-            <w:r>
-              <w:rPr>
-                <w:sz w:val="18"/>
-              </w:rPr>
-              <w:t xml:space="preserve">0.1733</w:t>
-            </w:r>
-          </w:p>
-        </w:tc>
-        <w:tc>
-          <w:tcPr/>
-          <w:p>
-            <w:pPr>
-              <w:pStyle w:val="Compact"/>
-              <w:jc w:val="right"/>
-            </w:pPr>
-            <w:r>
-              <w:rPr>
-                <w:sz w:val="18"/>
-              </w:rPr>
-              <w:t xml:space="preserve">0.567</w:t>
-            </w:r>
-          </w:p>
-        </w:tc>
-        <w:tc>
-          <w:tcPr/>
-          <w:p>
-            <w:pPr>
-              <w:pStyle w:val="Compact"/>
-              <w:jc w:val="right"/>
-            </w:pPr>
-            <w:r>
-              <w:rPr>
-                <w:sz w:val="18"/>
-              </w:rPr>
-              <w:t xml:space="preserve">1.657</w:t>
+              <w:t xml:space="preserve">0.464</w:t>
+            </w:r>
+          </w:p>
+        </w:tc>
+        <w:tc>
+          <w:tcPr/>
+          <w:p>
+            <w:pPr>
+              <w:pStyle w:val="Compact"/>
+              <w:jc w:val="right"/>
+            </w:pPr>
+            <w:r>
+              <w:rPr>
+                <w:sz w:val="18"/>
+              </w:rPr>
+              <w:t xml:space="preserve">20.8427</w:t>
+            </w:r>
+          </w:p>
+        </w:tc>
+        <w:tc>
+          <w:tcPr/>
+          <w:p>
+            <w:pPr>
+              <w:pStyle w:val="Compact"/>
+              <w:jc w:val="right"/>
+            </w:pPr>
+            <w:r>
+              <w:rPr>
+                <w:sz w:val="18"/>
+              </w:rPr>
+              <w:t xml:space="preserve">3.785</w:t>
+            </w:r>
+          </w:p>
+        </w:tc>
+        <w:tc>
+          <w:tcPr/>
+          <w:p>
+            <w:pPr>
+              <w:pStyle w:val="Compact"/>
+              <w:jc w:val="right"/>
+            </w:pPr>
+            <w:r>
+              <w:rPr>
+                <w:sz w:val="18"/>
+              </w:rPr>
+              <w:t xml:space="preserve">0.748</w:t>
+            </w:r>
+          </w:p>
+        </w:tc>
+        <w:tc>
+          <w:tcPr/>
+          <w:p>
+            <w:pPr>
+              <w:pStyle w:val="Compact"/>
+              <w:jc w:val="right"/>
+            </w:pPr>
+            <w:r>
+              <w:rPr>
+                <w:sz w:val="18"/>
+              </w:rPr>
+              <w:t xml:space="preserve">1.958</w:t>
             </w:r>
           </w:p>
         </w:tc>
@@ -5802,67 +5816,67 @@
               <w:rPr>
                 <w:sz w:val="18"/>
               </w:rPr>
-              <w:t xml:space="preserve">0.271</w:t>
-            </w:r>
-          </w:p>
-        </w:tc>
-        <w:tc>
-          <w:tcPr/>
-          <w:p>
-            <w:pPr>
-              <w:pStyle w:val="Compact"/>
-              <w:jc w:val="right"/>
-            </w:pPr>
-            <w:r>
-              <w:rPr>
-                <w:sz w:val="18"/>
-              </w:rPr>
-              <w:t xml:space="preserve">20.8289</w:t>
-            </w:r>
-          </w:p>
-        </w:tc>
-        <w:tc>
-          <w:tcPr/>
-          <w:p>
-            <w:pPr>
-              <w:pStyle w:val="Compact"/>
-              <w:jc w:val="right"/>
-            </w:pPr>
-            <w:r>
-              <w:rPr>
-                <w:sz w:val="18"/>
-              </w:rPr>
-              <w:t xml:space="preserve">0.1733</w:t>
-            </w:r>
-          </w:p>
-        </w:tc>
-        <w:tc>
-          <w:tcPr/>
-          <w:p>
-            <w:pPr>
-              <w:pStyle w:val="Compact"/>
-              <w:jc w:val="right"/>
-            </w:pPr>
-            <w:r>
-              <w:rPr>
-                <w:sz w:val="18"/>
-              </w:rPr>
-              <w:t xml:space="preserve">1.148</w:t>
-            </w:r>
-          </w:p>
-        </w:tc>
-        <w:tc>
-          <w:tcPr/>
-          <w:p>
-            <w:pPr>
-              <w:pStyle w:val="Compact"/>
-              <w:jc w:val="right"/>
-            </w:pPr>
-            <w:r>
-              <w:rPr>
-                <w:sz w:val="18"/>
-              </w:rPr>
-              <w:t xml:space="preserve">2.984</w:t>
+              <w:t xml:space="preserve">0.454</w:t>
+            </w:r>
+          </w:p>
+        </w:tc>
+        <w:tc>
+          <w:tcPr/>
+          <w:p>
+            <w:pPr>
+              <w:pStyle w:val="Compact"/>
+              <w:jc w:val="right"/>
+            </w:pPr>
+            <w:r>
+              <w:rPr>
+                <w:sz w:val="18"/>
+              </w:rPr>
+              <w:t xml:space="preserve">20.8428</w:t>
+            </w:r>
+          </w:p>
+        </w:tc>
+        <w:tc>
+          <w:tcPr/>
+          <w:p>
+            <w:pPr>
+              <w:pStyle w:val="Compact"/>
+              <w:jc w:val="right"/>
+            </w:pPr>
+            <w:r>
+              <w:rPr>
+                <w:sz w:val="18"/>
+              </w:rPr>
+              <w:t xml:space="preserve">3.730</w:t>
+            </w:r>
+          </w:p>
+        </w:tc>
+        <w:tc>
+          <w:tcPr/>
+          <w:p>
+            <w:pPr>
+              <w:pStyle w:val="Compact"/>
+              <w:jc w:val="right"/>
+            </w:pPr>
+            <w:r>
+              <w:rPr>
+                <w:sz w:val="18"/>
+              </w:rPr>
+              <w:t xml:space="preserve">1.261</w:t>
+            </w:r>
+          </w:p>
+        </w:tc>
+        <w:tc>
+          <w:tcPr/>
+          <w:p>
+            <w:pPr>
+              <w:pStyle w:val="Compact"/>
+              <w:jc w:val="right"/>
+            </w:pPr>
+            <w:r>
+              <w:rPr>
+                <w:sz w:val="18"/>
+              </w:rPr>
+              <w:t xml:space="preserve">3.400</w:t>
             </w:r>
           </w:p>
         </w:tc>
@@ -5909,67 +5923,67 @@
               <w:rPr>
                 <w:sz w:val="18"/>
               </w:rPr>
-              <w:t xml:space="preserve">0.273</w:t>
-            </w:r>
-          </w:p>
-        </w:tc>
-        <w:tc>
-          <w:tcPr/>
-          <w:p>
-            <w:pPr>
-              <w:pStyle w:val="Compact"/>
-              <w:jc w:val="right"/>
-            </w:pPr>
-            <w:r>
-              <w:rPr>
-                <w:sz w:val="18"/>
-              </w:rPr>
-              <w:t xml:space="preserve">20.8289</w:t>
-            </w:r>
-          </w:p>
-        </w:tc>
-        <w:tc>
-          <w:tcPr/>
-          <w:p>
-            <w:pPr>
-              <w:pStyle w:val="Compact"/>
-              <w:jc w:val="right"/>
-            </w:pPr>
-            <w:r>
-              <w:rPr>
-                <w:sz w:val="18"/>
-              </w:rPr>
-              <w:t xml:space="preserve">0.1733</w:t>
-            </w:r>
-          </w:p>
-        </w:tc>
-        <w:tc>
-          <w:tcPr/>
-          <w:p>
-            <w:pPr>
-              <w:pStyle w:val="Compact"/>
-              <w:jc w:val="right"/>
-            </w:pPr>
-            <w:r>
-              <w:rPr>
-                <w:sz w:val="18"/>
-              </w:rPr>
-              <w:t xml:space="preserve">2.418</w:t>
-            </w:r>
-          </w:p>
-        </w:tc>
-        <w:tc>
-          <w:tcPr/>
-          <w:p>
-            <w:pPr>
-              <w:pStyle w:val="Compact"/>
-              <w:jc w:val="right"/>
-            </w:pPr>
-            <w:r>
-              <w:rPr>
-                <w:sz w:val="18"/>
-              </w:rPr>
-              <w:t xml:space="preserve">6.341</w:t>
+              <w:t xml:space="preserve">0.519</w:t>
+            </w:r>
+          </w:p>
+        </w:tc>
+        <w:tc>
+          <w:tcPr/>
+          <w:p>
+            <w:pPr>
+              <w:pStyle w:val="Compact"/>
+              <w:jc w:val="right"/>
+            </w:pPr>
+            <w:r>
+              <w:rPr>
+                <w:sz w:val="18"/>
+              </w:rPr>
+              <w:t xml:space="preserve">20.8424</w:t>
+            </w:r>
+          </w:p>
+        </w:tc>
+        <w:tc>
+          <w:tcPr/>
+          <w:p>
+            <w:pPr>
+              <w:pStyle w:val="Compact"/>
+              <w:jc w:val="right"/>
+            </w:pPr>
+            <w:r>
+              <w:rPr>
+                <w:sz w:val="18"/>
+              </w:rPr>
+              <w:t xml:space="preserve">4.020</w:t>
+            </w:r>
+          </w:p>
+        </w:tc>
+        <w:tc>
+          <w:tcPr/>
+          <w:p>
+            <w:pPr>
+              <w:pStyle w:val="Compact"/>
+              <w:jc w:val="right"/>
+            </w:pPr>
+            <w:r>
+              <w:rPr>
+                <w:sz w:val="18"/>
+              </w:rPr>
+              <w:t xml:space="preserve">3.042</w:t>
+            </w:r>
+          </w:p>
+        </w:tc>
+        <w:tc>
+          <w:tcPr/>
+          <w:p>
+            <w:pPr>
+              <w:pStyle w:val="Compact"/>
+              <w:jc w:val="right"/>
+            </w:pPr>
+            <w:r>
+              <w:rPr>
+                <w:sz w:val="18"/>
+              </w:rPr>
+              <w:t xml:space="preserve">8.645</w:t>
             </w:r>
           </w:p>
         </w:tc>
@@ -6016,67 +6030,67 @@
               <w:rPr>
                 <w:sz w:val="18"/>
               </w:rPr>
-              <w:t xml:space="preserve">0.327</w:t>
-            </w:r>
-          </w:p>
-        </w:tc>
-        <w:tc>
-          <w:tcPr/>
-          <w:p>
-            <w:pPr>
-              <w:pStyle w:val="Compact"/>
-              <w:jc w:val="right"/>
-            </w:pPr>
-            <w:r>
-              <w:rPr>
-                <w:sz w:val="18"/>
-              </w:rPr>
-              <w:t xml:space="preserve">20.8284</w:t>
-            </w:r>
-          </w:p>
-        </w:tc>
-        <w:tc>
-          <w:tcPr/>
-          <w:p>
-            <w:pPr>
-              <w:pStyle w:val="Compact"/>
-              <w:jc w:val="right"/>
-            </w:pPr>
-            <w:r>
-              <w:rPr>
-                <w:sz w:val="18"/>
-              </w:rPr>
-              <w:t xml:space="preserve">0.1733</w:t>
-            </w:r>
-          </w:p>
-        </w:tc>
-        <w:tc>
-          <w:tcPr/>
-          <w:p>
-            <w:pPr>
-              <w:pStyle w:val="Compact"/>
-              <w:jc w:val="right"/>
-            </w:pPr>
-            <w:r>
-              <w:rPr>
-                <w:sz w:val="18"/>
-              </w:rPr>
-              <w:t xml:space="preserve">3.921</w:t>
-            </w:r>
-          </w:p>
-        </w:tc>
-        <w:tc>
-          <w:tcPr/>
-          <w:p>
-            <w:pPr>
-              <w:pStyle w:val="Compact"/>
-              <w:jc w:val="right"/>
-            </w:pPr>
-            <w:r>
-              <w:rPr>
-                <w:sz w:val="18"/>
-              </w:rPr>
-              <w:t xml:space="preserve">12.883</w:t>
+              <w:t xml:space="preserve">0.497</w:t>
+            </w:r>
+          </w:p>
+        </w:tc>
+        <w:tc>
+          <w:tcPr/>
+          <w:p>
+            <w:pPr>
+              <w:pStyle w:val="Compact"/>
+              <w:jc w:val="right"/>
+            </w:pPr>
+            <w:r>
+              <w:rPr>
+                <w:sz w:val="18"/>
+              </w:rPr>
+              <w:t xml:space="preserve">20.8425</w:t>
+            </w:r>
+          </w:p>
+        </w:tc>
+        <w:tc>
+          <w:tcPr/>
+          <w:p>
+            <w:pPr>
+              <w:pStyle w:val="Compact"/>
+              <w:jc w:val="right"/>
+            </w:pPr>
+            <w:r>
+              <w:rPr>
+                <w:sz w:val="18"/>
+              </w:rPr>
+              <w:t xml:space="preserve">3.993</w:t>
+            </w:r>
+          </w:p>
+        </w:tc>
+        <w:tc>
+          <w:tcPr/>
+          <w:p>
+            <w:pPr>
+              <w:pStyle w:val="Compact"/>
+              <w:jc w:val="right"/>
+            </w:pPr>
+            <w:r>
+              <w:rPr>
+                <w:sz w:val="18"/>
+              </w:rPr>
+              <w:t xml:space="preserve">4.833</w:t>
+            </w:r>
+          </w:p>
+        </w:tc>
+        <w:tc>
+          <w:tcPr/>
+          <w:p>
+            <w:pPr>
+              <w:pStyle w:val="Compact"/>
+              <w:jc w:val="right"/>
+            </w:pPr>
+            <w:r>
+              <w:rPr>
+                <w:sz w:val="18"/>
+              </w:rPr>
+              <w:t xml:space="preserve">12.424</w:t>
             </w:r>
           </w:p>
         </w:tc>
@@ -6123,67 +6137,67 @@
               <w:rPr>
                 <w:sz w:val="18"/>
               </w:rPr>
-              <w:t xml:space="preserve">0.325</w:t>
-            </w:r>
-          </w:p>
-        </w:tc>
-        <w:tc>
-          <w:tcPr/>
-          <w:p>
-            <w:pPr>
-              <w:pStyle w:val="Compact"/>
-              <w:jc w:val="right"/>
-            </w:pPr>
-            <w:r>
-              <w:rPr>
-                <w:sz w:val="18"/>
-              </w:rPr>
-              <w:t xml:space="preserve">20.8285</w:t>
-            </w:r>
-          </w:p>
-        </w:tc>
-        <w:tc>
-          <w:tcPr/>
-          <w:p>
-            <w:pPr>
-              <w:pStyle w:val="Compact"/>
-              <w:jc w:val="right"/>
-            </w:pPr>
-            <w:r>
-              <w:rPr>
-                <w:sz w:val="18"/>
-              </w:rPr>
-              <w:t xml:space="preserve">0.1733</w:t>
-            </w:r>
-          </w:p>
-        </w:tc>
-        <w:tc>
-          <w:tcPr/>
-          <w:p>
-            <w:pPr>
-              <w:pStyle w:val="Compact"/>
-              <w:jc w:val="right"/>
-            </w:pPr>
-            <w:r>
-              <w:rPr>
-                <w:sz w:val="18"/>
-              </w:rPr>
-              <w:t xml:space="preserve">5.862</w:t>
-            </w:r>
-          </w:p>
-        </w:tc>
-        <w:tc>
-          <w:tcPr/>
-          <w:p>
-            <w:pPr>
-              <w:pStyle w:val="Compact"/>
-              <w:jc w:val="right"/>
-            </w:pPr>
-            <w:r>
-              <w:rPr>
-                <w:sz w:val="18"/>
-              </w:rPr>
-              <w:t xml:space="preserve">21.786</w:t>
+              <w:t xml:space="preserve">0.345</w:t>
+            </w:r>
+          </w:p>
+        </w:tc>
+        <w:tc>
+          <w:tcPr/>
+          <w:p>
+            <w:pPr>
+              <w:pStyle w:val="Compact"/>
+              <w:jc w:val="right"/>
+            </w:pPr>
+            <w:r>
+              <w:rPr>
+                <w:sz w:val="18"/>
+              </w:rPr>
+              <w:t xml:space="preserve">20.8433</w:t>
+            </w:r>
+          </w:p>
+        </w:tc>
+        <w:tc>
+          <w:tcPr/>
+          <w:p>
+            <w:pPr>
+              <w:pStyle w:val="Compact"/>
+              <w:jc w:val="right"/>
+            </w:pPr>
+            <w:r>
+              <w:rPr>
+                <w:sz w:val="18"/>
+              </w:rPr>
+              <w:t xml:space="preserve">3.329</w:t>
+            </w:r>
+          </w:p>
+        </w:tc>
+        <w:tc>
+          <w:tcPr/>
+          <w:p>
+            <w:pPr>
+              <w:pStyle w:val="Compact"/>
+              <w:jc w:val="right"/>
+            </w:pPr>
+            <w:r>
+              <w:rPr>
+                <w:sz w:val="18"/>
+              </w:rPr>
+              <w:t xml:space="preserve">8.617</w:t>
+            </w:r>
+          </w:p>
+        </w:tc>
+        <w:tc>
+          <w:tcPr/>
+          <w:p>
+            <w:pPr>
+              <w:pStyle w:val="Compact"/>
+              <w:jc w:val="right"/>
+            </w:pPr>
+            <w:r>
+              <w:rPr>
+                <w:sz w:val="18"/>
+              </w:rPr>
+              <w:t xml:space="preserve">36.167</w:t>
             </w:r>
           </w:p>
         </w:tc>
@@ -6328,67 +6342,67 @@
               <w:rPr>
                 <w:sz w:val="18"/>
               </w:rPr>
-              <w:t xml:space="preserve">1.061</w:t>
-            </w:r>
-          </w:p>
-        </w:tc>
-        <w:tc>
-          <w:tcPr/>
-          <w:p>
-            <w:pPr>
-              <w:pStyle w:val="Compact"/>
-              <w:jc w:val="right"/>
-            </w:pPr>
-            <w:r>
-              <w:rPr>
-                <w:sz w:val="18"/>
-              </w:rPr>
-              <w:t xml:space="preserve">1.356</w:t>
-            </w:r>
-          </w:p>
-        </w:tc>
-        <w:tc>
-          <w:tcPr/>
-          <w:p>
-            <w:pPr>
-              <w:pStyle w:val="Compact"/>
-              <w:jc w:val="right"/>
-            </w:pPr>
-            <w:r>
-              <w:rPr>
-                <w:sz w:val="18"/>
-              </w:rPr>
-              <w:t xml:space="preserve">1.317</w:t>
-            </w:r>
-          </w:p>
-        </w:tc>
-        <w:tc>
-          <w:tcPr/>
-          <w:p>
-            <w:pPr>
-              <w:pStyle w:val="Compact"/>
-              <w:jc w:val="right"/>
-            </w:pPr>
-            <w:r>
-              <w:rPr>
-                <w:sz w:val="18"/>
-              </w:rPr>
-              <w:t xml:space="preserve">1.614</w:t>
-            </w:r>
-          </w:p>
-        </w:tc>
-        <w:tc>
-          <w:tcPr/>
-          <w:p>
-            <w:pPr>
-              <w:pStyle w:val="Compact"/>
-              <w:jc w:val="right"/>
-            </w:pPr>
-            <w:r>
-              <w:rPr>
-                <w:sz w:val="18"/>
-              </w:rPr>
-              <w:t xml:space="preserve">6.444</w:t>
+              <w:t xml:space="preserve">1.078</w:t>
+            </w:r>
+          </w:p>
+        </w:tc>
+        <w:tc>
+          <w:tcPr/>
+          <w:p>
+            <w:pPr>
+              <w:pStyle w:val="Compact"/>
+              <w:jc w:val="right"/>
+            </w:pPr>
+            <w:r>
+              <w:rPr>
+                <w:sz w:val="18"/>
+              </w:rPr>
+              <w:t xml:space="preserve">1.370</w:t>
+            </w:r>
+          </w:p>
+        </w:tc>
+        <w:tc>
+          <w:tcPr/>
+          <w:p>
+            <w:pPr>
+              <w:pStyle w:val="Compact"/>
+              <w:jc w:val="right"/>
+            </w:pPr>
+            <w:r>
+              <w:rPr>
+                <w:sz w:val="18"/>
+              </w:rPr>
+              <w:t xml:space="preserve">1.333</w:t>
+            </w:r>
+          </w:p>
+        </w:tc>
+        <w:tc>
+          <w:tcPr/>
+          <w:p>
+            <w:pPr>
+              <w:pStyle w:val="Compact"/>
+              <w:jc w:val="right"/>
+            </w:pPr>
+            <w:r>
+              <w:rPr>
+                <w:sz w:val="18"/>
+              </w:rPr>
+              <w:t xml:space="preserve">1.623</w:t>
+            </w:r>
+          </w:p>
+        </w:tc>
+        <w:tc>
+          <w:tcPr/>
+          <w:p>
+            <w:pPr>
+              <w:pStyle w:val="Compact"/>
+              <w:jc w:val="right"/>
+            </w:pPr>
+            <w:r>
+              <w:rPr>
+                <w:sz w:val="18"/>
+              </w:rPr>
+              <w:t xml:space="preserve">6.844</w:t>
             </w:r>
           </w:p>
         </w:tc>
@@ -6420,67 +6434,67 @@
               <w:rPr>
                 <w:sz w:val="18"/>
               </w:rPr>
-              <w:t xml:space="preserve">1.217</w:t>
-            </w:r>
-          </w:p>
-        </w:tc>
-        <w:tc>
-          <w:tcPr/>
-          <w:p>
-            <w:pPr>
-              <w:pStyle w:val="Compact"/>
-              <w:jc w:val="right"/>
-            </w:pPr>
-            <w:r>
-              <w:rPr>
-                <w:sz w:val="18"/>
-              </w:rPr>
-              <w:t xml:space="preserve">1.987</w:t>
-            </w:r>
-          </w:p>
-        </w:tc>
-        <w:tc>
-          <w:tcPr/>
-          <w:p>
-            <w:pPr>
-              <w:pStyle w:val="Compact"/>
-              <w:jc w:val="right"/>
-            </w:pPr>
-            <w:r>
-              <w:rPr>
-                <w:sz w:val="18"/>
-              </w:rPr>
-              <w:t xml:space="preserve">1.476</w:t>
-            </w:r>
-          </w:p>
-        </w:tc>
-        <w:tc>
-          <w:tcPr/>
-          <w:p>
-            <w:pPr>
-              <w:pStyle w:val="Compact"/>
-              <w:jc w:val="right"/>
-            </w:pPr>
-            <w:r>
-              <w:rPr>
-                <w:sz w:val="18"/>
-              </w:rPr>
-              <w:t xml:space="preserve">2.230</w:t>
-            </w:r>
-          </w:p>
-        </w:tc>
-        <w:tc>
-          <w:tcPr/>
-          <w:p>
-            <w:pPr>
-              <w:pStyle w:val="Compact"/>
-              <w:jc w:val="right"/>
-            </w:pPr>
-            <w:r>
-              <w:rPr>
-                <w:sz w:val="18"/>
-              </w:rPr>
-              <w:t xml:space="preserve">4.723</w:t>
+              <w:t xml:space="preserve">1.276</w:t>
+            </w:r>
+          </w:p>
+        </w:tc>
+        <w:tc>
+          <w:tcPr/>
+          <w:p>
+            <w:pPr>
+              <w:pStyle w:val="Compact"/>
+              <w:jc w:val="right"/>
+            </w:pPr>
+            <w:r>
+              <w:rPr>
+                <w:sz w:val="18"/>
+              </w:rPr>
+              <w:t xml:space="preserve">1.688</w:t>
+            </w:r>
+          </w:p>
+        </w:tc>
+        <w:tc>
+          <w:tcPr/>
+          <w:p>
+            <w:pPr>
+              <w:pStyle w:val="Compact"/>
+              <w:jc w:val="right"/>
+            </w:pPr>
+            <w:r>
+              <w:rPr>
+                <w:sz w:val="18"/>
+              </w:rPr>
+              <w:t xml:space="preserve">1.545</w:t>
+            </w:r>
+          </w:p>
+        </w:tc>
+        <w:tc>
+          <w:tcPr/>
+          <w:p>
+            <w:pPr>
+              <w:pStyle w:val="Compact"/>
+              <w:jc w:val="right"/>
+            </w:pPr>
+            <w:r>
+              <w:rPr>
+                <w:sz w:val="18"/>
+              </w:rPr>
+              <w:t xml:space="preserve">1.978</w:t>
+            </w:r>
+          </w:p>
+        </w:tc>
+        <w:tc>
+          <w:tcPr/>
+          <w:p>
+            <w:pPr>
+              <w:pStyle w:val="Compact"/>
+              <w:jc w:val="right"/>
+            </w:pPr>
+            <w:r>
+              <w:rPr>
+                <w:sz w:val="18"/>
+              </w:rPr>
+              <w:t xml:space="preserve">4.832</w:t>
             </w:r>
           </w:p>
         </w:tc>
@@ -6512,67 +6526,67 @@
               <w:rPr>
                 <w:sz w:val="18"/>
               </w:rPr>
-              <w:t xml:space="preserve">1.563</w:t>
-            </w:r>
-          </w:p>
-        </w:tc>
-        <w:tc>
-          <w:tcPr/>
-          <w:p>
-            <w:pPr>
-              <w:pStyle w:val="Compact"/>
-              <w:jc w:val="right"/>
-            </w:pPr>
-            <w:r>
-              <w:rPr>
-                <w:sz w:val="18"/>
-              </w:rPr>
-              <w:t xml:space="preserve">2.734</w:t>
-            </w:r>
-          </w:p>
-        </w:tc>
-        <w:tc>
-          <w:tcPr/>
-          <w:p>
-            <w:pPr>
-              <w:pStyle w:val="Compact"/>
-              <w:jc w:val="right"/>
-            </w:pPr>
-            <w:r>
-              <w:rPr>
-                <w:sz w:val="18"/>
-              </w:rPr>
-              <w:t xml:space="preserve">1.836</w:t>
-            </w:r>
-          </w:p>
-        </w:tc>
-        <w:tc>
-          <w:tcPr/>
-          <w:p>
-            <w:pPr>
-              <w:pStyle w:val="Compact"/>
-              <w:jc w:val="right"/>
-            </w:pPr>
-            <w:r>
-              <w:rPr>
-                <w:sz w:val="18"/>
-              </w:rPr>
-              <w:t xml:space="preserve">3.005</w:t>
-            </w:r>
-          </w:p>
-        </w:tc>
-        <w:tc>
-          <w:tcPr/>
-          <w:p>
-            <w:pPr>
-              <w:pStyle w:val="Compact"/>
-              <w:jc w:val="right"/>
-            </w:pPr>
-            <w:r>
-              <w:rPr>
-                <w:sz w:val="18"/>
-              </w:rPr>
-              <w:t xml:space="preserve">5.314</w:t>
+              <w:t xml:space="preserve">2.023</w:t>
+            </w:r>
+          </w:p>
+        </w:tc>
+        <w:tc>
+          <w:tcPr/>
+          <w:p>
+            <w:pPr>
+              <w:pStyle w:val="Compact"/>
+              <w:jc w:val="right"/>
+            </w:pPr>
+            <w:r>
+              <w:rPr>
+                <w:sz w:val="18"/>
+              </w:rPr>
+              <w:t xml:space="preserve">3.326</w:t>
+            </w:r>
+          </w:p>
+        </w:tc>
+        <w:tc>
+          <w:tcPr/>
+          <w:p>
+            <w:pPr>
+              <w:pStyle w:val="Compact"/>
+              <w:jc w:val="right"/>
+            </w:pPr>
+            <w:r>
+              <w:rPr>
+                <w:sz w:val="18"/>
+              </w:rPr>
+              <w:t xml:space="preserve">2.370</w:t>
+            </w:r>
+          </w:p>
+        </w:tc>
+        <w:tc>
+          <w:tcPr/>
+          <w:p>
+            <w:pPr>
+              <w:pStyle w:val="Compact"/>
+              <w:jc w:val="right"/>
+            </w:pPr>
+            <w:r>
+              <w:rPr>
+                <w:sz w:val="18"/>
+              </w:rPr>
+              <w:t xml:space="preserve">3.912</w:t>
+            </w:r>
+          </w:p>
+        </w:tc>
+        <w:tc>
+          <w:tcPr/>
+          <w:p>
+            <w:pPr>
+              <w:pStyle w:val="Compact"/>
+              <w:jc w:val="right"/>
+            </w:pPr>
+            <w:r>
+              <w:rPr>
+                <w:sz w:val="18"/>
+              </w:rPr>
+              <w:t xml:space="preserve">5.640</w:t>
             </w:r>
           </w:p>
         </w:tc>
@@ -6604,67 +6618,67 @@
               <w:rPr>
                 <w:sz w:val="18"/>
               </w:rPr>
-              <w:t xml:space="preserve">2.167</w:t>
-            </w:r>
-          </w:p>
-        </w:tc>
-        <w:tc>
-          <w:tcPr/>
-          <w:p>
-            <w:pPr>
-              <w:pStyle w:val="Compact"/>
-              <w:jc w:val="right"/>
-            </w:pPr>
-            <w:r>
-              <w:rPr>
-                <w:sz w:val="18"/>
-              </w:rPr>
-              <w:t xml:space="preserve">4.154</w:t>
-            </w:r>
-          </w:p>
-        </w:tc>
-        <w:tc>
-          <w:tcPr/>
-          <w:p>
-            <w:pPr>
-              <w:pStyle w:val="Compact"/>
-              <w:jc w:val="right"/>
-            </w:pPr>
-            <w:r>
-              <w:rPr>
-                <w:sz w:val="18"/>
-              </w:rPr>
-              <w:t xml:space="preserve">2.443</w:t>
-            </w:r>
-          </w:p>
-        </w:tc>
-        <w:tc>
-          <w:tcPr/>
-          <w:p>
-            <w:pPr>
-              <w:pStyle w:val="Compact"/>
-              <w:jc w:val="right"/>
-            </w:pPr>
-            <w:r>
-              <w:rPr>
-                <w:sz w:val="18"/>
-              </w:rPr>
-              <w:t xml:space="preserve">4.451</w:t>
-            </w:r>
-          </w:p>
-        </w:tc>
-        <w:tc>
-          <w:tcPr/>
-          <w:p>
-            <w:pPr>
-              <w:pStyle w:val="Compact"/>
-              <w:jc w:val="right"/>
-            </w:pPr>
-            <w:r>
-              <w:rPr>
-                <w:sz w:val="18"/>
-              </w:rPr>
-              <w:t xml:space="preserve">6.049</w:t>
+              <w:t xml:space="preserve">2.340</w:t>
+            </w:r>
+          </w:p>
+        </w:tc>
+        <w:tc>
+          <w:tcPr/>
+          <w:p>
+            <w:pPr>
+              <w:pStyle w:val="Compact"/>
+              <w:jc w:val="right"/>
+            </w:pPr>
+            <w:r>
+              <w:rPr>
+                <w:sz w:val="18"/>
+              </w:rPr>
+              <w:t xml:space="preserve">4.826</w:t>
+            </w:r>
+          </w:p>
+        </w:tc>
+        <w:tc>
+          <w:tcPr/>
+          <w:p>
+            <w:pPr>
+              <w:pStyle w:val="Compact"/>
+              <w:jc w:val="right"/>
+            </w:pPr>
+            <w:r>
+              <w:rPr>
+                <w:sz w:val="18"/>
+              </w:rPr>
+              <w:t xml:space="preserve">2.614</w:t>
+            </w:r>
+          </w:p>
+        </w:tc>
+        <w:tc>
+          <w:tcPr/>
+          <w:p>
+            <w:pPr>
+              <w:pStyle w:val="Compact"/>
+              <w:jc w:val="right"/>
+            </w:pPr>
+            <w:r>
+              <w:rPr>
+                <w:sz w:val="18"/>
+              </w:rPr>
+              <w:t xml:space="preserve">5.090</w:t>
+            </w:r>
+          </w:p>
+        </w:tc>
+        <w:tc>
+          <w:tcPr/>
+          <w:p>
+            <w:pPr>
+              <w:pStyle w:val="Compact"/>
+              <w:jc w:val="right"/>
+            </w:pPr>
+            <w:r>
+              <w:rPr>
+                <w:sz w:val="18"/>
+              </w:rPr>
+              <w:t xml:space="preserve">6.119</w:t>
             </w:r>
           </w:p>
         </w:tc>
@@ -6696,67 +6710,67 @@
               <w:rPr>
                 <w:sz w:val="18"/>
               </w:rPr>
-              <w:t xml:space="preserve">3.510</w:t>
-            </w:r>
-          </w:p>
-        </w:tc>
-        <w:tc>
-          <w:tcPr/>
-          <w:p>
-            <w:pPr>
-              <w:pStyle w:val="Compact"/>
-              <w:jc w:val="right"/>
-            </w:pPr>
-            <w:r>
-              <w:rPr>
-                <w:sz w:val="18"/>
-              </w:rPr>
-              <w:t xml:space="preserve">7.784</w:t>
-            </w:r>
-          </w:p>
-        </w:tc>
-        <w:tc>
-          <w:tcPr/>
-          <w:p>
-            <w:pPr>
-              <w:pStyle w:val="Compact"/>
-              <w:jc w:val="right"/>
-            </w:pPr>
-            <w:r>
-              <w:rPr>
-                <w:sz w:val="18"/>
-              </w:rPr>
-              <w:t xml:space="preserve">3.797</w:t>
-            </w:r>
-          </w:p>
-        </w:tc>
-        <w:tc>
-          <w:tcPr/>
-          <w:p>
-            <w:pPr>
-              <w:pStyle w:val="Compact"/>
-              <w:jc w:val="right"/>
-            </w:pPr>
-            <w:r>
-              <w:rPr>
-                <w:sz w:val="18"/>
-              </w:rPr>
-              <w:t xml:space="preserve">8.139</w:t>
-            </w:r>
-          </w:p>
-        </w:tc>
-        <w:tc>
-          <w:tcPr/>
-          <w:p>
-            <w:pPr>
-              <w:pStyle w:val="Compact"/>
-              <w:jc w:val="right"/>
-            </w:pPr>
-            <w:r>
-              <w:rPr>
-                <w:sz w:val="18"/>
-              </w:rPr>
-              <w:t xml:space="preserve">7.666</w:t>
+              <w:t xml:space="preserve">4.183</w:t>
+            </w:r>
+          </w:p>
+        </w:tc>
+        <w:tc>
+          <w:tcPr/>
+          <w:p>
+            <w:pPr>
+              <w:pStyle w:val="Compact"/>
+              <w:jc w:val="right"/>
+            </w:pPr>
+            <w:r>
+              <w:rPr>
+                <w:sz w:val="18"/>
+              </w:rPr>
+              <w:t xml:space="preserve">9.948</w:t>
+            </w:r>
+          </w:p>
+        </w:tc>
+        <w:tc>
+          <w:tcPr/>
+          <w:p>
+            <w:pPr>
+              <w:pStyle w:val="Compact"/>
+              <w:jc w:val="right"/>
+            </w:pPr>
+            <w:r>
+              <w:rPr>
+                <w:sz w:val="18"/>
+              </w:rPr>
+              <w:t xml:space="preserve">4.479</w:t>
+            </w:r>
+          </w:p>
+        </w:tc>
+        <w:tc>
+          <w:tcPr/>
+          <w:p>
+            <w:pPr>
+              <w:pStyle w:val="Compact"/>
+              <w:jc w:val="right"/>
+            </w:pPr>
+            <w:r>
+              <w:rPr>
+                <w:sz w:val="18"/>
+              </w:rPr>
+              <w:t xml:space="preserve">10.267</w:t>
+            </w:r>
+          </w:p>
+        </w:tc>
+        <w:tc>
+          <w:tcPr/>
+          <w:p>
+            <w:pPr>
+              <w:pStyle w:val="Compact"/>
+              <w:jc w:val="right"/>
+            </w:pPr>
+            <w:r>
+              <w:rPr>
+                <w:sz w:val="18"/>
+              </w:rPr>
+              <w:t xml:space="preserve">7.423</w:t>
             </w:r>
           </w:p>
         </w:tc>
@@ -6788,67 +6802,67 @@
               <w:rPr>
                 <w:sz w:val="18"/>
               </w:rPr>
-              <w:t xml:space="preserve">5.133</w:t>
-            </w:r>
-          </w:p>
-        </w:tc>
-        <w:tc>
-          <w:tcPr/>
-          <w:p>
-            <w:pPr>
-              <w:pStyle w:val="Compact"/>
-              <w:jc w:val="right"/>
-            </w:pPr>
-            <w:r>
-              <w:rPr>
-                <w:sz w:val="18"/>
-              </w:rPr>
-              <w:t xml:space="preserve">14.104</w:t>
-            </w:r>
-          </w:p>
-        </w:tc>
-        <w:tc>
-          <w:tcPr/>
-          <w:p>
-            <w:pPr>
-              <w:pStyle w:val="Compact"/>
-              <w:jc w:val="right"/>
-            </w:pPr>
-            <w:r>
-              <w:rPr>
-                <w:sz w:val="18"/>
-              </w:rPr>
-              <w:t xml:space="preserve">5.451</w:t>
-            </w:r>
-          </w:p>
-        </w:tc>
-        <w:tc>
-          <w:tcPr/>
-          <w:p>
-            <w:pPr>
-              <w:pStyle w:val="Compact"/>
-              <w:jc w:val="right"/>
-            </w:pPr>
-            <w:r>
-              <w:rPr>
-                <w:sz w:val="18"/>
-              </w:rPr>
-              <w:t xml:space="preserve">14.702</w:t>
-            </w:r>
-          </w:p>
-        </w:tc>
-        <w:tc>
-          <w:tcPr/>
-          <w:p>
-            <w:pPr>
-              <w:pStyle w:val="Compact"/>
-              <w:jc w:val="right"/>
-            </w:pPr>
-            <w:r>
-              <w:rPr>
-                <w:sz w:val="18"/>
-              </w:rPr>
-              <w:t xml:space="preserve">10.800</w:t>
+              <w:t xml:space="preserve">6.111</w:t>
+            </w:r>
+          </w:p>
+        </w:tc>
+        <w:tc>
+          <w:tcPr/>
+          <w:p>
+            <w:pPr>
+              <w:pStyle w:val="Compact"/>
+              <w:jc w:val="right"/>
+            </w:pPr>
+            <w:r>
+              <w:rPr>
+                <w:sz w:val="18"/>
+              </w:rPr>
+              <w:t xml:space="preserve">13.745</w:t>
+            </w:r>
+          </w:p>
+        </w:tc>
+        <w:tc>
+          <w:tcPr/>
+          <w:p>
+            <w:pPr>
+              <w:pStyle w:val="Compact"/>
+              <w:jc w:val="right"/>
+            </w:pPr>
+            <w:r>
+              <w:rPr>
+                <w:sz w:val="18"/>
+              </w:rPr>
+              <w:t xml:space="preserve">6.457</w:t>
+            </w:r>
+          </w:p>
+        </w:tc>
+        <w:tc>
+          <w:tcPr/>
+          <w:p>
+            <w:pPr>
+              <w:pStyle w:val="Compact"/>
+              <w:jc w:val="right"/>
+            </w:pPr>
+            <w:r>
+              <w:rPr>
+                <w:sz w:val="18"/>
+              </w:rPr>
+              <w:t xml:space="preserve">14.077</w:t>
+            </w:r>
+          </w:p>
+        </w:tc>
+        <w:tc>
+          <w:tcPr/>
+          <w:p>
+            <w:pPr>
+              <w:pStyle w:val="Compact"/>
+              <w:jc w:val="right"/>
+            </w:pPr>
+            <w:r>
+              <w:rPr>
+                <w:sz w:val="18"/>
+              </w:rPr>
+              <w:t xml:space="preserve">9.219</w:t>
             </w:r>
           </w:p>
         </w:tc>
@@ -6880,67 +6894,67 @@
               <w:rPr>
                 <w:sz w:val="18"/>
               </w:rPr>
-              <w:t xml:space="preserve">7.153</w:t>
-            </w:r>
-          </w:p>
-        </w:tc>
-        <w:tc>
-          <w:tcPr/>
-          <w:p>
-            <w:pPr>
-              <w:pStyle w:val="Compact"/>
-              <w:jc w:val="right"/>
-            </w:pPr>
-            <w:r>
-              <w:rPr>
-                <w:sz w:val="18"/>
-              </w:rPr>
-              <w:t xml:space="preserve">23.324</w:t>
-            </w:r>
-          </w:p>
-        </w:tc>
-        <w:tc>
-          <w:tcPr/>
-          <w:p>
-            <w:pPr>
-              <w:pStyle w:val="Compact"/>
-              <w:jc w:val="right"/>
-            </w:pPr>
-            <w:r>
-              <w:rPr>
-                <w:sz w:val="18"/>
-              </w:rPr>
-              <w:t xml:space="preserve">7.487</w:t>
-            </w:r>
-          </w:p>
-        </w:tc>
-        <w:tc>
-          <w:tcPr/>
-          <w:p>
-            <w:pPr>
-              <w:pStyle w:val="Compact"/>
-              <w:jc w:val="right"/>
-            </w:pPr>
-            <w:r>
-              <w:rPr>
-                <w:sz w:val="18"/>
-              </w:rPr>
-              <w:t xml:space="preserve">23.811</w:t>
-            </w:r>
-          </w:p>
-        </w:tc>
-        <w:tc>
-          <w:tcPr/>
-          <w:p>
-            <w:pPr>
-              <w:pStyle w:val="Compact"/>
-              <w:jc w:val="right"/>
-            </w:pPr>
-            <w:r>
-              <w:rPr>
-                <w:sz w:val="18"/>
-              </w:rPr>
-              <w:t xml:space="preserve">10.887</w:t>
+              <w:t xml:space="preserve">10.029</w:t>
+            </w:r>
+          </w:p>
+        </w:tc>
+        <w:tc>
+          <w:tcPr/>
+          <w:p>
+            <w:pPr>
+              <w:pStyle w:val="Compact"/>
+              <w:jc w:val="right"/>
+            </w:pPr>
+            <w:r>
+              <w:rPr>
+                <w:sz w:val="18"/>
+              </w:rPr>
+              <w:t xml:space="preserve">37.857</w:t>
+            </w:r>
+          </w:p>
+        </w:tc>
+        <w:tc>
+          <w:tcPr/>
+          <w:p>
+            <w:pPr>
+              <w:pStyle w:val="Compact"/>
+              <w:jc w:val="right"/>
+            </w:pPr>
+            <w:r>
+              <w:rPr>
+                <w:sz w:val="18"/>
+              </w:rPr>
+              <w:t xml:space="preserve">10.425</w:t>
+            </w:r>
+          </w:p>
+        </w:tc>
+        <w:tc>
+          <w:tcPr/>
+          <w:p>
+            <w:pPr>
+              <w:pStyle w:val="Compact"/>
+              <w:jc w:val="right"/>
+            </w:pPr>
+            <w:r>
+              <w:rPr>
+                <w:sz w:val="18"/>
+              </w:rPr>
+              <w:t xml:space="preserve">38.304</w:t>
+            </w:r>
+          </w:p>
+        </w:tc>
+        <w:tc>
+          <w:tcPr/>
+          <w:p>
+            <w:pPr>
+              <w:pStyle w:val="Compact"/>
+              <w:jc w:val="right"/>
+            </w:pPr>
+            <w:r>
+              <w:rPr>
+                <w:sz w:val="18"/>
+              </w:rPr>
+              <w:t xml:space="preserve">16.303</w:t>
             </w:r>
           </w:p>
         </w:tc>
@@ -6960,7 +6974,23 @@
         <w:pStyle w:val="FirstParagraph"/>
       </w:pPr>
       <w:r>
-        <w:t xml:space="preserve">各组在 0.066 s 刚退出最大正电压时，位置约 45.725 mm、速度约 1.139 m/s，距目标约 4.275 mm。此时 N=5 首个电压约 7.795 V，而 N=20 约 5.498 V；短视控制器在相近实测状态下仍选择较弱制动，较长视野能计入更远的终点误差与压力演化。</w:t>
+        <w:t xml:space="preserve">原参数的无杆腔局部压力释放时间常数仅为 1 ms，短于 N=5 的 5 ms 预测视野；三组压力已能在近似相同的时间内建立和释放，因此图上几乎重合。原三组 P2≥20 MPa 的持续时间约为 4.384、3.989、4.000 ms，N=5 与 N=20 仅差 0.395 ms。</w:t>
+      </w:r>
+    </w:p>
+    <w:p>
+      <w:pPr>
+        <w:pStyle w:val="BodyText"/>
+      </w:pPr>
+      <w:r>
+        <w:t xml:space="preserve">本次统一增大无杆腔等效容积并调整共同质量、黏性阻尼和速度权重，使无杆腔局部时间常数成为 8 ms。N=5 看不到完整的压力释放过程，N=20/50 能将其后续效应计入规划。这些是所有 N 共用的教学工况设置，没有为单条曲线单独调参。</w:t>
+      </w:r>
+    </w:p>
+    <w:p>
+      <w:pPr>
+        <w:pStyle w:val="BodyText"/>
+      </w:pPr>
+      <w:r>
+        <w:t xml:space="preserve">各组在 0.073 s 的位置约 46.414 mm、速度约 1.0763 m/s，距目标约 3.586 mm。此时 N=5 首个电压约 7.222 V，而 N=20 约 2.826 V；短视控制器在相近实测状态下选择较弱制动，较长视野更早减少正向驱动，计入后续终点误差与压力演化。</w:t>
       </w:r>
     </w:p>
     <w:p>
@@ -7128,7 +7158,7 @@
             <m:t>≈</m:t>
           </m:r>
           <m:r>
-            <m:t>214.4</m:t>
+            <m:t>343.8</m:t>
           </m:r>
           <m:r>
             <m:t> </m:t>
@@ -7214,7 +7244,7 @@
           <m:t>≈</m:t>
         </m:r>
         <m:r>
-          <m:t>5.31</m:t>
+          <m:t>3.13</m:t>
         </m:r>
       </m:oMath>
       <w:r>
@@ -7280,7 +7310,7 @@
           <m:t>≈</m:t>
         </m:r>
         <m:r>
-          <m:t>3.03</m:t>
+          <m:t>1.68</m:t>
         </m:r>
       </m:oMath>
       <w:r>
@@ -7363,7 +7393,7 @@
             <m:t>=</m:t>
           </m:r>
           <m:r>
-            <m:t>1</m:t>
+            <m:t>8</m:t>
           </m:r>
           <m:r>
             <m:t> </m:t>
@@ -7484,120 +7514,104 @@
         <w:pStyle w:val="FirstParagraph"/>
       </w:pPr>
       <w:r>
-        <w:t xml:space="preserve">用</w:t>
-      </w:r>
-      <w:r>
-        <w:t xml:space="preserve"> </w:t>
-      </w:r>
-      <m:oMath>
-        <m:sSub>
-          <m:e>
-            <m:r>
-              <m:t>τ</m:t>
-            </m:r>
-          </m:e>
-          <m:sub>
-            <m:r>
-              <m:t>h</m:t>
-            </m:r>
-          </m:sub>
-        </m:sSub>
-        <m:r>
-          <m:rPr>
-            <m:sty m:val="p"/>
-          </m:rPr>
-          <m:t>∼</m:t>
-        </m:r>
-        <m:r>
-          <m:t>2</m:t>
-        </m:r>
-      </m:oMath>
-      <w:r>
-        <w:t xml:space="preserve"> </w:t>
-      </w:r>
-      <w:r>
-        <w:t xml:space="preserve">ms 估计液压建立延迟，制动时长量级约为</w:t>
-      </w:r>
-      <w:r>
-        <w:t xml:space="preserve"> </w:t>
-      </w:r>
-      <m:oMath>
-        <m:r>
-          <m:t>5.31</m:t>
-        </m:r>
-        <m:r>
-          <m:rPr>
-            <m:sty m:val="p"/>
-          </m:rPr>
-          <m:t>+</m:t>
-        </m:r>
-        <m:r>
-          <m:t>2</m:t>
-        </m:r>
-        <m:r>
-          <m:rPr>
-            <m:sty m:val="p"/>
-          </m:rPr>
-          <m:t>=</m:t>
-        </m:r>
-        <m:r>
-          <m:t>7.31</m:t>
-        </m:r>
-      </m:oMath>
-      <w:r>
-        <w:t xml:space="preserve"> </w:t>
-      </w:r>
-      <w:r>
-        <w:t xml:space="preserve">ms，距离量级约为</w:t>
-      </w:r>
-      <w:r>
-        <w:t xml:space="preserve"> </w:t>
-      </w:r>
-      <m:oMath>
-        <m:r>
-          <m:t>3.03</m:t>
-        </m:r>
-        <m:r>
-          <m:rPr>
-            <m:sty m:val="p"/>
-          </m:rPr>
-          <m:t>+</m:t>
-        </m:r>
-        <m:r>
-          <m:t>v</m:t>
-        </m:r>
-        <m:sSub>
-          <m:e>
-            <m:r>
-              <m:t>τ</m:t>
-            </m:r>
-          </m:e>
-          <m:sub>
-            <m:r>
-              <m:t>h</m:t>
-            </m:r>
-          </m:sub>
-        </m:sSub>
-        <m:r>
-          <m:rPr>
-            <m:sty m:val="p"/>
-          </m:rPr>
-          <m:t>=</m:t>
-        </m:r>
-        <m:r>
-          <m:t>5.30</m:t>
-        </m:r>
-      </m:oMath>
-      <w:r>
-        <w:t xml:space="preserve"> </w:t>
-      </w:r>
-      <w:r>
-        <w:t xml:space="preserve">mm。该附加延迟法只是工程量级估计，不是严格最短时间解或递归可行性证明。它说明 5 ms 视野短于完整制动演化，20 ms 视野则能覆盖主要制动过程。压力硬约束阻止短视控制器用任意强的后续反向输入追回已损失的距离，因而留下较大超调。</w:t>
+        <w:t xml:space="preserve">这些时间常数描述连续压力状态的演化，不能把整个 8 ms 直接当成纯滞后加到理想制动时间上。实际记录从 0.073 s 起，到速度首次过零，三组均需约 6.5–6.7 ms（按采样速度插值）；N=5 在这段过程中对终点之后的演化覆盖不足，留下较大超调。这说明“瞬时达到最大允许减速度”的制动距离不能直接用作当前液压对象的真实停止距离。压力硬约束又阻止短视控制器用任意强的后续反向输入追回已损失的距离。</w:t>
       </w:r>
     </w:p>
     <w:bookmarkEnd w:id="29"/>
-    <w:bookmarkEnd w:id="30"/>
-    <w:bookmarkStart w:id="31" w:name="计时口径与整定窗口"/>
+    <w:bookmarkStart w:id="34" w:name="压力差异应比较持续时间与释放时刻"/>
+    <w:p>
+      <w:pPr>
+        <w:pStyle w:val="Heading3"/>
+      </w:pPr>
+      <w:r>
+        <w:t xml:space="preserve">4.2 压力差异应比较持续时间与释放时刻</w:t>
+      </w:r>
+    </w:p>
+    <w:p>
+      <w:pPr>
+        <w:pStyle w:val="CaptionedFigure"/>
+      </w:pPr>
+      <w:r>
+        <w:drawing>
+          <wp:inline>
+            <wp:extent cx="8961120" cy="5844207"/>
+            <wp:effectExtent b="0" l="0" r="0" t="0"/>
+            <wp:docPr descr="制动窗口压力与对应电压放大图" title="" id="31" name="Picture"/>
+            <a:graphic>
+              <a:graphicData uri="http://schemas.openxmlformats.org/drawingml/2006/picture">
+                <pic:pic>
+                  <pic:nvPicPr>
+                    <pic:cNvPr descr="outputs/pressure_braking_detail.png" id="32" name="Picture"/>
+                    <pic:cNvPicPr>
+                      <a:picLocks noChangeArrowheads="1" noChangeAspect="1"/>
+                    </pic:cNvPicPr>
+                  </pic:nvPicPr>
+                  <pic:blipFill>
+                    <a:blip r:embed="rId30"/>
+                    <a:stretch>
+                      <a:fillRect/>
+                    </a:stretch>
+                  </pic:blipFill>
+                  <pic:spPr bwMode="auto">
+                    <a:xfrm>
+                      <a:off x="0" y="0"/>
+                      <a:ext cx="8961120" cy="5844207"/>
+                    </a:xfrm>
+                    <a:prstGeom prst="rect">
+                      <a:avLst/>
+                    </a:prstGeom>
+                    <a:noFill/>
+                    <a:ln w="9525">
+                      <a:noFill/>
+                      <a:headEnd/>
+                      <a:tailEnd/>
+                    </a:ln>
+                  </pic:spPr>
+                </pic:pic>
+              </a:graphicData>
+            </a:graphic>
+          </wp:inline>
+        </w:drawing>
+      </w:r>
+    </w:p>
+    <w:p>
+      <w:pPr>
+        <w:pStyle w:val="ImageCaption"/>
+      </w:pPr>
+      <w:r>
+        <w:t xml:space="preserve">制动窗口压力与对应电压放大图</w:t>
+      </w:r>
+    </w:p>
+    <w:p>
+      <w:pPr>
+        <w:pStyle w:val="BodyText"/>
+      </w:pPr>
+      <w:r>
+        <w:t xml:space="preserve">三组共享 21 MPa 安全上界，因此峰值相近是合理结果；时域差异主要体现在同一时刻的压力状态和何时退出高压段。本次 N=5/20/50 的 P2≥20 MPa 持续时间为 5.075、3.730、3.329 ms。N=5 与 N=20 的持续时间差增至 1.345 ms，约为原工况的 3.4 倍。</w:t>
+      </w:r>
+    </w:p>
+    <w:p>
+      <w:pPr>
+        <w:pStyle w:val="BodyText"/>
+      </w:pPr>
+      <w:r>
+        <w:t xml:space="preserve">在 t=0.080 s，三组 P2 分别为 20.350、10.038、9.295 MPa。N=5 仍接近限压边界，N=20/50 已进入明显的压力释放段，形成约 10 MPa 的同时刻压力差。放大图使用完全相同的物理时间轴和纵轴，没有把曲线平移或加偏置；总持续时间由保存的高密压力轨迹及其阈值交点线性插值计算。N=5 后续压力回到 2 MPa，0.11 s 后控制电压也已明显衰减，不能把持续高压误读为永久极限环。</w:t>
+      </w:r>
+      <w:hyperlink r:id="rId33">
+        <w:r>
+          <w:rPr>
+            <w:rStyle w:val="Hyperlink"/>
+          </w:rPr>
+          <w:t xml:space="preserve">新旧量化对照</w:t>
+        </w:r>
+      </w:hyperlink>
+      <w:r>
+        <w:t xml:space="preserve">及同目录的修订前参数、图和原始压力记录可复核上述变化。</w:t>
+      </w:r>
+    </w:p>
+    <w:bookmarkEnd w:id="34"/>
+    <w:bookmarkEnd w:id="35"/>
+    <w:bookmarkStart w:id="36" w:name="计时口径与整定窗口"/>
     <w:p>
       <w:pPr>
         <w:pStyle w:val="Heading2"/>
@@ -7827,8 +7841,8 @@
         <w:t xml:space="preserve">本次局部模型中，N=10 已取得与 N=15/20 相近的位移精度，且计算成本更低，因此它也是该基准下值得优先考察的候选点。这说明课件的 15–25 不是跨对象通用的最优区间；应依据实际制动时间、精度收益和目标硬件的最坏耗时重新选择。当前结果不能用来排除 N=10 或证明 N=20 全局最优。</w:t>
       </w:r>
     </w:p>
-    <w:bookmarkEnd w:id="31"/>
-    <w:bookmarkStart w:id="32" w:name="与参考图的差异及模型边界"/>
+    <w:bookmarkEnd w:id="36"/>
+    <w:bookmarkStart w:id="37" w:name="与参考图的差异及模型边界"/>
     <w:p>
       <w:pPr>
         <w:pStyle w:val="Heading2"/>
@@ -7850,7 +7864,7 @@
         <w:pStyle w:val="BodyText"/>
       </w:pPr>
       <w:r>
-        <w:t xml:space="preserve">仍可见的数值差别包括：本模型在 0.04 s 的巡航 P2 约为 7.75 MPa，首次到达目标约为 0.072 s，参考图目测约为 0.06 s；本次连续峰压约 20.83 MPa，参考示意接近 21 MPa。控制电压的起动爬升、制动细节和高时域耗时也不同。回油压差、局部压力阻尼和工作点选择导致前述压力与速度差异，不能通过绘图平移、截断、重置压力或替换实测耗时来消除。</w:t>
+        <w:t xml:space="preserve">仍可见的数值差别包括：本模型在 0.04 s 的 P2 约为 0.35 MPa，接近恒速的 0.06–0.07 s 约为 5.1 MPa；首次到达目标约为 0.078 s，参考图目测约为 0.06 s。本次连续峰压约 20.84–20.86 MPa，参考示意接近 21 MPa。N=5 的平台延长程度和后续反弹也未逐点复现参考图。回油压差、局部压力阻尼和工作点选择导致前述压力与速度差异，不能通过绘图平移、截断、重置压力或替换实测耗时来消除。</w:t>
       </w:r>
     </w:p>
     <w:p>
@@ -7861,8 +7875,8 @@
         <w:t xml:space="preserve">局部线性对象没有验证完整根号孔口方程、阀死区和负载漂移下的鲁棒性。因此此次连续安全结论限定于声明的教学模型、固定参数和已验证的闭环运行；扩展到非线性模型或实机应重新构造工作点/约束裕量并测试。</w:t>
       </w:r>
     </w:p>
-    <w:bookmarkEnd w:id="32"/>
-    <w:bookmarkStart w:id="33" w:name="可复现性与验证结论"/>
+    <w:bookmarkEnd w:id="37"/>
+    <w:bookmarkStart w:id="38" w:name="可复现性与验证结论"/>
     <w:p>
       <w:pPr>
         <w:pStyle w:val="Heading2"/>
@@ -7933,7 +7947,7 @@
         <w:t xml:space="preserve">passed: true</w:t>
       </w:r>
       <w:r>
-        <w:t xml:space="preserve">。它独立核对七组样本、首步执行、反馈重置、预测计划、输入和压力界、统计口径及矩阵维度，并用独立 SI 力学/流量方程及 DOP853 重放全部实际电压；连续压力极值也由独立积分轨迹重新搜索。模型与 MPC 测试另核对单位/符号、ZOH、直接递推与凝聚矩阵、稀疏与凝聚 QP 等价性、子步压力约束等。</w:t>
+        <w:t xml:space="preserve">。它独立核对七组样本、首步执行、反馈重置、预测计划、输入和压力界、统计口径及矩阵维度，并用独立 SI 力学/流量方程及 DOP853 重放全部实际电压；连续压力极值也由独立积分轨迹重新搜索。八项测试另核对单位/符号、ZOH、直接递推与凝聚矩阵、稀疏与凝聚 QP 等价性、子步压力约束，以及本次压力分离、稳定收敛和连续安全的实际闭环行为。</w:t>
       </w:r>
     </w:p>
     <w:p>
@@ -8017,8 +8031,8 @@
         <w:t xml:space="preserve">交付目录含源代码、配置、PNG/PDF 四联图、定量表、原始轨迹、求解日志、课件、本文及 Word 报告。修改参数后必须重跑实验和验证；本报告数值对应本次保存的结果，不应与其他参数版本混用。</w:t>
       </w:r>
     </w:p>
-    <w:bookmarkEnd w:id="33"/>
-    <w:bookmarkEnd w:id="34"/>
+    <w:bookmarkEnd w:id="38"/>
+    <w:bookmarkEnd w:id="39"/>
     <w:sectPr>
       <w:pgSz w:w="16834" w:h="11909"/>
       <w:pgMar w:top="864" w:bottom="864" w:left="936" w:right="936"/>

</xml_diff>